<commit_message>
remove deviceTypes from deviceCategory
</commit_message>
<xml_diff>
--- a/באגים.docx
+++ b/באגים.docx
@@ -40,7 +40,6 @@
           <w:rtl/>
         </w:rPr>
       </w:pPr>
-      <w:proofErr w:type="spellStart"/>
       <w:r>
         <w:rPr>
           <w:rFonts w:hint="cs"/>
@@ -48,7 +47,6 @@
         </w:rPr>
         <w:t>וולידציות</w:t>
       </w:r>
-      <w:proofErr w:type="spellEnd"/>
     </w:p>
     <w:p>
       <w:pPr>
@@ -94,18 +92,103 @@
     <w:p>
       <w:pPr>
         <w:rPr>
-          <w:rFonts w:hint="cs"/>
-        </w:rPr>
-      </w:pPr>
-      <w:r>
-        <w:rPr>
-          <w:rFonts w:hint="cs"/>
-          <w:rtl/>
-        </w:rPr>
-        <w:t xml:space="preserve">פעיל - </w:t>
+          <w:rtl/>
+        </w:rPr>
+      </w:pPr>
+      <w:r>
+        <w:rPr>
+          <w:rFonts w:hint="cs"/>
+          <w:rtl/>
+        </w:rPr>
+        <w:t xml:space="preserve">פעיל </w:t>
+      </w:r>
+      <w:r>
+        <w:rPr>
+          <w:rtl/>
+        </w:rPr>
+        <w:t>–</w:t>
+      </w:r>
+      <w:r>
+        <w:rPr>
+          <w:rFonts w:hint="cs"/>
+          <w:rtl/>
+        </w:rPr>
+        <w:t xml:space="preserve"> </w:t>
       </w:r>
       <w:r>
         <w:t>toggle</w:t>
+      </w:r>
+    </w:p>
+    <w:p>
+      <w:pPr>
+        <w:rPr>
+          <w:rtl/>
+        </w:rPr>
+      </w:pPr>
+    </w:p>
+    <w:p>
+      <w:pPr>
+        <w:rPr>
+          <w:b/>
+          <w:bCs/>
+          <w:rtl/>
+        </w:rPr>
+      </w:pPr>
+      <w:r>
+        <w:rPr>
+          <w:rFonts w:hint="cs"/>
+          <w:b/>
+          <w:bCs/>
+          <w:rtl/>
+        </w:rPr>
+        <w:t>חנויות</w:t>
+      </w:r>
+      <w:r>
+        <w:rPr>
+          <w:rFonts w:hint="cs"/>
+          <w:b/>
+          <w:bCs/>
+          <w:rtl/>
+        </w:rPr>
+        <w:t>:</w:t>
+      </w:r>
+    </w:p>
+    <w:p>
+      <w:pPr>
+        <w:rPr>
+          <w:rFonts w:hint="cs"/>
+          <w:rtl/>
+        </w:rPr>
+      </w:pPr>
+      <w:r>
+        <w:rPr>
+          <w:rFonts w:hint="cs"/>
+          <w:rtl/>
+        </w:rPr>
+        <w:t xml:space="preserve">ליד הכתובת מייל </w:t>
+      </w:r>
+      <w:r>
+        <w:rPr>
+          <w:rtl/>
+        </w:rPr>
+        <w:t>–</w:t>
+      </w:r>
+      <w:r>
+        <w:rPr>
+          <w:rFonts w:hint="cs"/>
+          <w:rtl/>
+        </w:rPr>
+        <w:t xml:space="preserve"> שיהיה לינק קטן של </w:t>
+      </w:r>
+      <w:r>
+        <w:t xml:space="preserve">mailto </w:t>
+      </w:r>
+      <w:r>
+        <w:rPr>
+          <w:rFonts w:hint="cs"/>
+          <w:rtl/>
+        </w:rPr>
+        <w:t xml:space="preserve"> וזה יפתח את המייל...</w:t>
       </w:r>
     </w:p>
     <w:sectPr>

</xml_diff>

<commit_message>
fix reuests branch bug
</commit_message>
<xml_diff>
--- a/באגים.docx
+++ b/באגים.docx
@@ -141,31 +141,92 @@
           <w:bCs/>
           <w:rtl/>
         </w:rPr>
-        <w:t>חנויות</w:t>
-      </w:r>
-      <w:r>
-        <w:rPr>
-          <w:rFonts w:hint="cs"/>
+        <w:t>חנויות:</w:t>
+      </w:r>
+    </w:p>
+    <w:p>
+      <w:pPr>
+        <w:rPr>
+          <w:rtl/>
+        </w:rPr>
+      </w:pPr>
+      <w:r>
+        <w:rPr>
+          <w:rFonts w:hint="cs"/>
+          <w:rtl/>
+        </w:rPr>
+        <w:t xml:space="preserve">ליד הכתובת מייל </w:t>
+      </w:r>
+      <w:r>
+        <w:rPr>
+          <w:rtl/>
+        </w:rPr>
+        <w:t>–</w:t>
+      </w:r>
+      <w:r>
+        <w:rPr>
+          <w:rFonts w:hint="cs"/>
+          <w:rtl/>
+        </w:rPr>
+        <w:t xml:space="preserve"> שיהיה לינק קטן של </w:t>
+      </w:r>
+      <w:r>
+        <w:t xml:space="preserve">mailto </w:t>
+      </w:r>
+      <w:r>
+        <w:rPr>
+          <w:rFonts w:hint="cs"/>
+          <w:rtl/>
+        </w:rPr>
+        <w:t xml:space="preserve"> וזה יפתח את המייל...</w:t>
+      </w:r>
+    </w:p>
+    <w:p>
+      <w:pPr>
+        <w:rPr>
+          <w:rtl/>
+        </w:rPr>
+      </w:pPr>
+    </w:p>
+    <w:p>
+      <w:pPr>
+        <w:rPr>
           <w:b/>
           <w:bCs/>
           <w:rtl/>
         </w:rPr>
+      </w:pPr>
+      <w:r>
+        <w:rPr>
+          <w:rFonts w:hint="cs"/>
+          <w:b/>
+          <w:bCs/>
+          <w:rtl/>
+        </w:rPr>
+        <w:t>בקשות סניפים</w:t>
+      </w:r>
+      <w:r>
+        <w:rPr>
+          <w:rFonts w:hint="cs"/>
+          <w:b/>
+          <w:bCs/>
+          <w:rtl/>
+        </w:rPr>
         <w:t>:</w:t>
       </w:r>
     </w:p>
     <w:p>
       <w:pPr>
         <w:rPr>
-          <w:rFonts w:hint="cs"/>
-          <w:rtl/>
-        </w:rPr>
-      </w:pPr>
-      <w:r>
-        <w:rPr>
-          <w:rFonts w:hint="cs"/>
-          <w:rtl/>
-        </w:rPr>
-        <w:t xml:space="preserve">ליד הכתובת מייל </w:t>
+          <w:rtl/>
+        </w:rPr>
+      </w:pPr>
+      <w:r>
+        <w:rPr>
+          <w:rFonts w:hint="cs"/>
+          <w:rtl/>
+        </w:rPr>
+        <w:t xml:space="preserve">בטבלה, שם הסניף יוצג כשירשור: שם סניף </w:t>
       </w:r>
       <w:r>
         <w:rPr>
@@ -178,17 +239,32 @@
           <w:rFonts w:hint="cs"/>
           <w:rtl/>
         </w:rPr>
-        <w:t xml:space="preserve"> שיהיה לינק קטן של </w:t>
-      </w:r>
-      <w:r>
-        <w:t xml:space="preserve">mailto </w:t>
-      </w:r>
-      <w:r>
-        <w:rPr>
-          <w:rFonts w:hint="cs"/>
-          <w:rtl/>
-        </w:rPr>
-        <w:t xml:space="preserve"> וזה יפתח את המייל...</w:t>
+        <w:t xml:space="preserve"> עיר רחוב</w:t>
+      </w:r>
+    </w:p>
+    <w:p>
+      <w:pPr>
+        <w:rPr>
+          <w:rFonts w:hint="cs"/>
+          <w:rtl/>
+        </w:rPr>
+      </w:pPr>
+      <w:r>
+        <w:rPr>
+          <w:rFonts w:hint="cs"/>
+          <w:rtl/>
+        </w:rPr>
+        <w:t xml:space="preserve">האם בוצע </w:t>
+      </w:r>
+      <w:r>
+        <w:t xml:space="preserve">toggle </w:t>
+      </w:r>
+      <w:r>
+        <w:rPr>
+          <w:rFonts w:hint="cs"/>
+          <w:rtl/>
+        </w:rPr>
+        <w:t xml:space="preserve"> וייקלט באופן אוטומטי התאריך</w:t>
       </w:r>
     </w:p>
     <w:sectPr>

</xml_diff>

<commit_message>
add bugs to file
</commit_message>
<xml_diff>
--- a/באגים.docx
+++ b/באגים.docx
@@ -203,16 +203,7 @@
           <w:bCs/>
           <w:rtl/>
         </w:rPr>
-        <w:t>בקשות סניפים</w:t>
-      </w:r>
-      <w:r>
-        <w:rPr>
-          <w:rFonts w:hint="cs"/>
-          <w:b/>
-          <w:bCs/>
-          <w:rtl/>
-        </w:rPr>
-        <w:t>:</w:t>
+        <w:t>בקשות סניפים:</w:t>
       </w:r>
     </w:p>
     <w:p>
@@ -245,7 +236,6 @@
     <w:p>
       <w:pPr>
         <w:rPr>
-          <w:rFonts w:hint="cs"/>
           <w:rtl/>
         </w:rPr>
       </w:pPr>
@@ -266,6 +256,557 @@
         </w:rPr>
         <w:t xml:space="preserve"> וייקלט באופן אוטומטי התאריך</w:t>
       </w:r>
+    </w:p>
+    <w:p>
+      <w:pPr>
+        <w:rPr>
+          <w:rtl/>
+        </w:rPr>
+      </w:pPr>
+    </w:p>
+    <w:p>
+      <w:pPr>
+        <w:rPr>
+          <w:b/>
+          <w:bCs/>
+        </w:rPr>
+      </w:pPr>
+      <w:r>
+        <w:rPr>
+          <w:b/>
+          <w:bCs/>
+        </w:rPr>
+        <w:t>Dashboard</w:t>
+      </w:r>
+    </w:p>
+    <w:p/>
+    <w:p>
+      <w:pPr>
+        <w:rPr>
+          <w:b/>
+          <w:bCs/>
+          <w:rtl/>
+        </w:rPr>
+      </w:pPr>
+      <w:r>
+        <w:rPr>
+          <w:rFonts w:hint="cs"/>
+          <w:b/>
+          <w:bCs/>
+          <w:rtl/>
+        </w:rPr>
+        <w:t xml:space="preserve">טבלת חברות </w:t>
+      </w:r>
+      <w:r>
+        <w:rPr>
+          <w:b/>
+          <w:bCs/>
+          <w:rtl/>
+        </w:rPr>
+        <w:t>–</w:t>
+      </w:r>
+      <w:r>
+        <w:rPr>
+          <w:rFonts w:hint="cs"/>
+          <w:b/>
+          <w:bCs/>
+          <w:rtl/>
+        </w:rPr>
+        <w:t xml:space="preserve"> הוספת הטבלה החדשה</w:t>
+      </w:r>
+    </w:p>
+    <w:p>
+      <w:pPr>
+        <w:rPr>
+          <w:rtl/>
+        </w:rPr>
+      </w:pPr>
+      <w:r>
+        <w:rPr>
+          <w:rFonts w:hint="cs"/>
+          <w:rtl/>
+        </w:rPr>
+        <w:t>שמות השדות: שם חברה</w:t>
+      </w:r>
+    </w:p>
+    <w:p>
+      <w:pPr>
+        <w:rPr>
+          <w:rtl/>
+        </w:rPr>
+      </w:pPr>
+    </w:p>
+    <w:p>
+      <w:pPr>
+        <w:rPr>
+          <w:b/>
+          <w:bCs/>
+          <w:rtl/>
+        </w:rPr>
+      </w:pPr>
+      <w:r>
+        <w:rPr>
+          <w:rFonts w:hint="cs"/>
+          <w:b/>
+          <w:bCs/>
+          <w:rtl/>
+        </w:rPr>
+        <w:t>מכשירים:</w:t>
+      </w:r>
+    </w:p>
+    <w:p>
+      <w:pPr>
+        <w:rPr>
+          <w:rtl/>
+        </w:rPr>
+      </w:pPr>
+      <w:r>
+        <w:rPr>
+          <w:rFonts w:hint="cs"/>
+          <w:rtl/>
+        </w:rPr>
+        <w:t>וולידציה בהכנסת מספור שכבר קיים  - הודעה בעברית</w:t>
+      </w:r>
+    </w:p>
+    <w:p>
+      <w:r>
+        <w:rPr>
+          <w:rFonts w:hint="cs"/>
+          <w:rtl/>
+        </w:rPr>
+        <w:t xml:space="preserve">האם פנוי </w:t>
+      </w:r>
+      <w:r>
+        <w:rPr>
+          <w:rtl/>
+        </w:rPr>
+        <w:t>–</w:t>
+      </w:r>
+      <w:r>
+        <w:rPr>
+          <w:rFonts w:hint="cs"/>
+          <w:rtl/>
+        </w:rPr>
+        <w:t xml:space="preserve"> </w:t>
+      </w:r>
+      <w:r>
+        <w:t>toggle</w:t>
+      </w:r>
+    </w:p>
+    <w:p>
+      <w:pPr>
+        <w:rPr>
+          <w:rtl/>
+        </w:rPr>
+      </w:pPr>
+      <w:r>
+        <w:rPr>
+          <w:rFonts w:hint="cs"/>
+          <w:rtl/>
+        </w:rPr>
+        <w:t xml:space="preserve">חברה </w:t>
+      </w:r>
+      <w:r>
+        <w:rPr>
+          <w:rtl/>
+        </w:rPr>
+        <w:t>–</w:t>
+      </w:r>
+      <w:r>
+        <w:rPr>
+          <w:rFonts w:hint="cs"/>
+          <w:rtl/>
+        </w:rPr>
+        <w:t xml:space="preserve"> </w:t>
+      </w:r>
+      <w:r>
+        <w:t>dropdown</w:t>
+      </w:r>
+    </w:p>
+    <w:p>
+      <w:pPr>
+        <w:rPr>
+          <w:rtl/>
+        </w:rPr>
+      </w:pPr>
+    </w:p>
+    <w:p>
+      <w:pPr>
+        <w:rPr>
+          <w:rtl/>
+        </w:rPr>
+      </w:pPr>
+      <w:r>
+        <w:rPr>
+          <w:rFonts w:hint="cs"/>
+          <w:rtl/>
+        </w:rPr>
+        <w:t>השאלות:</w:t>
+      </w:r>
+    </w:p>
+    <w:p>
+      <w:pPr>
+        <w:rPr>
+          <w:rtl/>
+        </w:rPr>
+      </w:pPr>
+      <w:r>
+        <w:rPr>
+          <w:rFonts w:hint="cs"/>
+          <w:rtl/>
+        </w:rPr>
+        <w:t>חסר עריכה</w:t>
+      </w:r>
+    </w:p>
+    <w:p>
+      <w:pPr>
+        <w:rPr>
+          <w:rtl/>
+        </w:rPr>
+      </w:pPr>
+      <w:r>
+        <w:rPr>
+          <w:rFonts w:hint="cs"/>
+          <w:rtl/>
+        </w:rPr>
+        <w:t>טבלה:</w:t>
+      </w:r>
+    </w:p>
+    <w:p>
+      <w:pPr>
+        <w:rPr>
+          <w:rtl/>
+        </w:rPr>
+      </w:pPr>
+      <w:r>
+        <w:rPr>
+          <w:rFonts w:hint="cs"/>
+          <w:rtl/>
+        </w:rPr>
+        <w:t xml:space="preserve">מספר מכשיר </w:t>
+      </w:r>
+      <w:r>
+        <w:rPr>
+          <w:rtl/>
+        </w:rPr>
+        <w:t>–</w:t>
+      </w:r>
+      <w:r>
+        <w:rPr>
+          <w:rFonts w:hint="cs"/>
+          <w:rtl/>
+        </w:rPr>
+        <w:t xml:space="preserve"> יש לשרשר למספר המכשיר גם את המכשיר ולמי משויך </w:t>
+      </w:r>
+      <w:r>
+        <w:rPr>
+          <w:rtl/>
+        </w:rPr>
+        <w:t>–</w:t>
+      </w:r>
+      <w:r>
+        <w:rPr>
+          <w:rFonts w:hint="cs"/>
+          <w:rtl/>
+        </w:rPr>
+        <w:t xml:space="preserve"> כמו שיש בפופאפ</w:t>
+      </w:r>
+    </w:p>
+    <w:p>
+      <w:pPr>
+        <w:rPr>
+          <w:rtl/>
+        </w:rPr>
+      </w:pPr>
+      <w:r>
+        <w:rPr>
+          <w:rFonts w:hint="cs"/>
+        </w:rPr>
+        <w:t>D</w:t>
+      </w:r>
+      <w:r>
+        <w:t>eviceType</w:t>
+      </w:r>
+      <w:r>
+        <w:rPr>
+          <w:rFonts w:hint="cs"/>
+          <w:rtl/>
+        </w:rPr>
+        <w:t xml:space="preserve"> </w:t>
+      </w:r>
+      <w:r>
+        <w:rPr>
+          <w:rtl/>
+        </w:rPr>
+        <w:t>–</w:t>
+      </w:r>
+      <w:r>
+        <w:rPr>
+          <w:rFonts w:hint="cs"/>
+          <w:rtl/>
+        </w:rPr>
+        <w:t xml:space="preserve"> למחוק</w:t>
+      </w:r>
+    </w:p>
+    <w:p>
+      <w:r>
+        <w:rPr>
+          <w:rFonts w:hint="cs"/>
+          <w:rtl/>
+        </w:rPr>
+        <w:t xml:space="preserve">סטטוס </w:t>
+      </w:r>
+      <w:r>
+        <w:rPr>
+          <w:rtl/>
+        </w:rPr>
+        <w:t>–</w:t>
+      </w:r>
+      <w:r>
+        <w:rPr>
+          <w:rFonts w:hint="cs"/>
+          <w:rtl/>
+        </w:rPr>
+        <w:t xml:space="preserve"> </w:t>
+      </w:r>
+      <w:r>
+        <w:t>toggle</w:t>
+      </w:r>
+    </w:p>
+    <w:p>
+      <w:pPr>
+        <w:rPr>
+          <w:rtl/>
+        </w:rPr>
+      </w:pPr>
+      <w:r>
+        <w:rPr>
+          <w:rFonts w:hint="cs"/>
+          <w:rtl/>
+        </w:rPr>
+        <w:t>הערות</w:t>
+      </w:r>
+    </w:p>
+    <w:p>
+      <w:pPr>
+        <w:rPr>
+          <w:rtl/>
+        </w:rPr>
+      </w:pPr>
+      <w:r>
+        <w:rPr>
+          <w:rFonts w:hint="cs"/>
+          <w:rtl/>
+        </w:rPr>
+        <w:lastRenderedPageBreak/>
+        <w:t>פופאפ:</w:t>
+      </w:r>
+    </w:p>
+    <w:p>
+      <w:pPr>
+        <w:rPr>
+          <w:rtl/>
+        </w:rPr>
+      </w:pPr>
+      <w:r>
+        <w:rPr>
+          <w:rFonts w:hint="cs"/>
+          <w:rtl/>
+        </w:rPr>
+        <w:t xml:space="preserve">שם פרטי </w:t>
+      </w:r>
+      <w:r>
+        <w:rPr>
+          <w:rtl/>
+        </w:rPr>
+        <w:t>–</w:t>
+      </w:r>
+      <w:r>
+        <w:rPr>
+          <w:rFonts w:hint="cs"/>
+          <w:rtl/>
+        </w:rPr>
+        <w:t xml:space="preserve"> למחוק</w:t>
+      </w:r>
+    </w:p>
+    <w:p>
+      <w:pPr>
+        <w:rPr>
+          <w:rtl/>
+        </w:rPr>
+      </w:pPr>
+      <w:r>
+        <w:t>depositeType</w:t>
+      </w:r>
+      <w:r>
+        <w:rPr>
+          <w:rFonts w:hint="cs"/>
+          <w:rtl/>
+        </w:rPr>
+        <w:t xml:space="preserve"> </w:t>
+      </w:r>
+      <w:r>
+        <w:rPr>
+          <w:rtl/>
+        </w:rPr>
+        <w:t>–</w:t>
+      </w:r>
+      <w:r>
+        <w:rPr>
+          <w:rFonts w:hint="cs"/>
+          <w:rtl/>
+        </w:rPr>
+        <w:t xml:space="preserve"> זה מזומן צק</w:t>
+      </w:r>
+    </w:p>
+    <w:p>
+      <w:pPr>
+        <w:rPr>
+          <w:rtl/>
+        </w:rPr>
+      </w:pPr>
+      <w:r>
+        <w:t>depositeAmmount</w:t>
+      </w:r>
+      <w:r>
+        <w:rPr>
+          <w:rFonts w:hint="cs"/>
+          <w:rtl/>
+        </w:rPr>
+        <w:t xml:space="preserve"> </w:t>
+      </w:r>
+      <w:r>
+        <w:rPr>
+          <w:rtl/>
+        </w:rPr>
+        <w:t>–</w:t>
+      </w:r>
+      <w:r>
+        <w:rPr>
+          <w:rFonts w:hint="cs"/>
+          <w:rtl/>
+        </w:rPr>
+        <w:t xml:space="preserve"> למחוק</w:t>
+      </w:r>
+    </w:p>
+    <w:p>
+      <w:pPr>
+        <w:rPr>
+          <w:rtl/>
+        </w:rPr>
+      </w:pPr>
+      <w:r>
+        <w:rPr>
+          <w:rFonts w:hint="cs"/>
+          <w:rtl/>
+        </w:rPr>
+        <w:t>סטטוס</w:t>
+      </w:r>
+    </w:p>
+    <w:p>
+      <w:pPr>
+        <w:rPr>
+          <w:rtl/>
+        </w:rPr>
+      </w:pPr>
+    </w:p>
+    <w:p>
+      <w:pPr>
+        <w:rPr>
+          <w:rtl/>
+        </w:rPr>
+      </w:pPr>
+      <w:r>
+        <w:rPr>
+          <w:rFonts w:hint="cs"/>
+          <w:rtl/>
+        </w:rPr>
+        <w:t xml:space="preserve">מוצרים </w:t>
+      </w:r>
+      <w:r>
+        <w:rPr>
+          <w:rtl/>
+        </w:rPr>
+        <w:t>–</w:t>
+      </w:r>
+      <w:r>
+        <w:rPr>
+          <w:rFonts w:hint="cs"/>
+          <w:rtl/>
+        </w:rPr>
+        <w:t xml:space="preserve"> בניית טבלה חדשה</w:t>
+      </w:r>
+    </w:p>
+    <w:p>
+      <w:pPr>
+        <w:rPr>
+          <w:rtl/>
+        </w:rPr>
+      </w:pPr>
+      <w:r>
+        <w:rPr>
+          <w:rFonts w:hint="cs"/>
+          <w:rtl/>
+        </w:rPr>
+        <w:t>שדות: קטגוריה, חברה, דגם, הערות</w:t>
+      </w:r>
+    </w:p>
+    <w:p>
+      <w:pPr>
+        <w:rPr>
+          <w:rtl/>
+        </w:rPr>
+      </w:pPr>
+    </w:p>
+    <w:p>
+      <w:pPr>
+        <w:rPr>
+          <w:rtl/>
+        </w:rPr>
+      </w:pPr>
+      <w:r>
+        <w:rPr>
+          <w:rFonts w:hint="cs"/>
+          <w:rtl/>
+        </w:rPr>
+        <w:t xml:space="preserve">רכישות: </w:t>
+      </w:r>
+    </w:p>
+    <w:p>
+      <w:pPr>
+        <w:rPr>
+          <w:rFonts w:hint="cs"/>
+          <w:rtl/>
+        </w:rPr>
+      </w:pPr>
+      <w:r>
+        <w:rPr>
+          <w:rFonts w:hint="cs"/>
+          <w:rtl/>
+        </w:rPr>
+        <w:t xml:space="preserve">מוצר </w:t>
+      </w:r>
+      <w:r>
+        <w:rPr>
+          <w:rtl/>
+        </w:rPr>
+        <w:t>–</w:t>
+      </w:r>
+      <w:r>
+        <w:rPr>
+          <w:rFonts w:hint="cs"/>
+          <w:rtl/>
+        </w:rPr>
+        <w:t xml:space="preserve"> שרשור של קטגוריה + דגם</w:t>
+      </w:r>
+    </w:p>
+    <w:p/>
+    <w:p>
+      <w:pPr>
+        <w:rPr>
+          <w:rFonts w:hint="cs"/>
+        </w:rPr>
+      </w:pPr>
     </w:p>
     <w:sectPr>
       <w:pgSz w:w="11906" w:h="16838"/>

</xml_diff>

<commit_message>
add edit mode to loan controller
</commit_message>
<xml_diff>
--- a/באגים.docx
+++ b/באגים.docx
@@ -191,6 +191,7 @@
     <w:p>
       <w:pPr>
         <w:rPr>
+          <w:rFonts w:hint="cs"/>
           <w:rtl/>
         </w:rPr>
       </w:pPr>
@@ -329,12 +330,51 @@
           <w:rtl/>
         </w:rPr>
       </w:pPr>
-      <w:r>
-        <w:rPr>
-          <w:rFonts w:hint="cs"/>
-          <w:rtl/>
-        </w:rPr>
-        <w:t xml:space="preserve">חברה </w:t>
+    </w:p>
+    <w:p>
+      <w:pPr>
+        <w:rPr>
+          <w:b/>
+          <w:bCs/>
+          <w:rtl/>
+        </w:rPr>
+      </w:pPr>
+      <w:r>
+        <w:rPr>
+          <w:rFonts w:hint="cs"/>
+          <w:b/>
+          <w:bCs/>
+          <w:rtl/>
+        </w:rPr>
+        <w:t>השאלות:</w:t>
+      </w:r>
+    </w:p>
+    <w:p>
+      <w:pPr>
+        <w:rPr>
+          <w:rtl/>
+        </w:rPr>
+      </w:pPr>
+      <w:r>
+        <w:rPr>
+          <w:rFonts w:hint="cs"/>
+          <w:rtl/>
+        </w:rPr>
+        <w:t>טבלה:</w:t>
+      </w:r>
+    </w:p>
+    <w:p>
+      <w:pPr>
+        <w:rPr>
+          <w:rtl/>
+        </w:rPr>
+      </w:pPr>
+      <w:r>
+        <w:rPr>
+          <w:rFonts w:hint="cs"/>
+          <w:rtl/>
+        </w:rPr>
+        <w:t xml:space="preserve">מספר מכשיר </w:t>
       </w:r>
       <w:r>
         <w:rPr>
@@ -347,76 +387,121 @@
           <w:rFonts w:hint="cs"/>
           <w:rtl/>
         </w:rPr>
+        <w:t xml:space="preserve"> יש לשרשר למספר המכשיר גם את המכשיר ולמי משויך </w:t>
+      </w:r>
+      <w:r>
+        <w:rPr>
+          <w:rtl/>
+        </w:rPr>
+        <w:t>–</w:t>
+      </w:r>
+      <w:r>
+        <w:rPr>
+          <w:rFonts w:hint="cs"/>
+          <w:rtl/>
+        </w:rPr>
+        <w:t xml:space="preserve"> כמו שיש </w:t>
+      </w:r>
+      <w:proofErr w:type="spellStart"/>
+      <w:r>
+        <w:rPr>
+          <w:rFonts w:hint="cs"/>
+          <w:rtl/>
+        </w:rPr>
+        <w:t>בפופאפ</w:t>
+      </w:r>
+      <w:proofErr w:type="spellEnd"/>
+    </w:p>
+    <w:p>
+      <w:r>
+        <w:rPr>
+          <w:rFonts w:hint="cs"/>
+          <w:rtl/>
+        </w:rPr>
+        <w:t xml:space="preserve">סטטוס </w:t>
+      </w:r>
+      <w:r>
+        <w:rPr>
+          <w:rtl/>
+        </w:rPr>
+        <w:t>–</w:t>
+      </w:r>
+      <w:r>
+        <w:rPr>
+          <w:rFonts w:hint="cs"/>
+          <w:rtl/>
+        </w:rPr>
         <w:t xml:space="preserve"> </w:t>
       </w:r>
       <w:r>
-        <w:t>dropdown</w:t>
-      </w:r>
-    </w:p>
-    <w:p>
-      <w:pPr>
-        <w:rPr>
-          <w:rtl/>
-        </w:rPr>
-      </w:pPr>
-    </w:p>
-    <w:p>
-      <w:pPr>
-        <w:rPr>
-          <w:rtl/>
-        </w:rPr>
-      </w:pPr>
-      <w:r>
-        <w:rPr>
-          <w:rFonts w:hint="cs"/>
-          <w:rtl/>
-        </w:rPr>
-        <w:t>השאלות:</w:t>
-      </w:r>
-    </w:p>
-    <w:p>
-      <w:pPr>
-        <w:rPr>
-          <w:rtl/>
-        </w:rPr>
-      </w:pPr>
-      <w:r>
-        <w:rPr>
-          <w:rFonts w:hint="cs"/>
-          <w:rtl/>
-        </w:rPr>
-        <w:t>חסר עריכה</w:t>
-      </w:r>
-    </w:p>
-    <w:p>
-      <w:pPr>
-        <w:rPr>
-          <w:rtl/>
-        </w:rPr>
-      </w:pPr>
-      <w:r>
-        <w:rPr>
-          <w:rFonts w:hint="cs"/>
-          <w:rtl/>
-        </w:rPr>
-        <w:t>טבלה:</w:t>
-      </w:r>
-    </w:p>
-    <w:p>
-      <w:pPr>
-        <w:rPr>
-          <w:rtl/>
-        </w:rPr>
-      </w:pPr>
-      <w:r>
-        <w:rPr>
-          <w:rFonts w:hint="cs"/>
-          <w:rtl/>
-        </w:rPr>
-        <w:t xml:space="preserve">מספר מכשיר </w:t>
-      </w:r>
-      <w:r>
-        <w:rPr>
+        <w:t>toggle</w:t>
+      </w:r>
+    </w:p>
+    <w:p>
+      <w:pPr>
+        <w:rPr>
+          <w:rtl/>
+        </w:rPr>
+      </w:pPr>
+      <w:proofErr w:type="spellStart"/>
+      <w:r>
+        <w:rPr>
+          <w:rFonts w:hint="cs"/>
+          <w:rtl/>
+        </w:rPr>
+        <w:t>פופאפ</w:t>
+      </w:r>
+      <w:proofErr w:type="spellEnd"/>
+      <w:r>
+        <w:rPr>
+          <w:rFonts w:hint="cs"/>
+          <w:rtl/>
+        </w:rPr>
+        <w:t>:</w:t>
+      </w:r>
+    </w:p>
+    <w:p>
+      <w:pPr>
+        <w:rPr>
+          <w:rtl/>
+        </w:rPr>
+      </w:pPr>
+      <w:r>
+        <w:rPr>
+          <w:rFonts w:hint="cs"/>
+          <w:rtl/>
+        </w:rPr>
+        <w:t>סטטוס</w:t>
+      </w:r>
+    </w:p>
+    <w:p>
+      <w:pPr>
+        <w:rPr>
+          <w:rtl/>
+        </w:rPr>
+      </w:pPr>
+    </w:p>
+    <w:p>
+      <w:pPr>
+        <w:rPr>
+          <w:b/>
+          <w:bCs/>
+          <w:rtl/>
+        </w:rPr>
+      </w:pPr>
+      <w:r>
+        <w:rPr>
+          <w:rFonts w:hint="cs"/>
+          <w:b/>
+          <w:bCs/>
+          <w:rtl/>
+        </w:rPr>
+        <w:t xml:space="preserve">מוצרים </w:t>
+      </w:r>
+      <w:r>
+        <w:rPr>
+          <w:b/>
+          <w:bCs/>
           <w:rtl/>
         </w:rPr>
         <w:t>–</w:t>
@@ -424,9 +509,59 @@
       <w:r>
         <w:rPr>
           <w:rFonts w:hint="cs"/>
-          <w:rtl/>
-        </w:rPr>
-        <w:t xml:space="preserve"> יש לשרשר למספר המכשיר גם את המכשיר ולמי משויך </w:t>
+          <w:b/>
+          <w:bCs/>
+          <w:rtl/>
+        </w:rPr>
+        <w:t xml:space="preserve"> בניית טבלה חדשה</w:t>
+      </w:r>
+    </w:p>
+    <w:p>
+      <w:pPr>
+        <w:rPr>
+          <w:rtl/>
+        </w:rPr>
+      </w:pPr>
+      <w:r>
+        <w:rPr>
+          <w:rFonts w:hint="cs"/>
+          <w:rtl/>
+        </w:rPr>
+        <w:t>שדות: קטגוריה, חברה, דגם, הערות</w:t>
+      </w:r>
+    </w:p>
+    <w:p>
+      <w:pPr>
+        <w:rPr>
+          <w:rtl/>
+        </w:rPr>
+      </w:pPr>
+    </w:p>
+    <w:p>
+      <w:pPr>
+        <w:rPr>
+          <w:b/>
+          <w:bCs/>
+          <w:rtl/>
+        </w:rPr>
+      </w:pPr>
+      <w:r>
+        <w:rPr>
+          <w:rFonts w:hint="cs"/>
+          <w:b/>
+          <w:bCs/>
+          <w:rtl/>
+        </w:rPr>
+        <w:t xml:space="preserve">רכישות: </w:t>
+      </w:r>
+    </w:p>
+    <w:p>
+      <w:r>
+        <w:rPr>
+          <w:rFonts w:hint="cs"/>
+          <w:rtl/>
+        </w:rPr>
+        <w:t xml:space="preserve">מוצר </w:t>
       </w:r>
       <w:r>
         <w:rPr>
@@ -439,179 +574,9 @@
           <w:rFonts w:hint="cs"/>
           <w:rtl/>
         </w:rPr>
-        <w:t xml:space="preserve"> כמו שיש </w:t>
-      </w:r>
-      <w:proofErr w:type="spellStart"/>
-      <w:r>
-        <w:rPr>
-          <w:rFonts w:hint="cs"/>
-          <w:rtl/>
-        </w:rPr>
-        <w:t>בפופאפ</w:t>
-      </w:r>
-      <w:proofErr w:type="spellEnd"/>
-    </w:p>
-    <w:p>
-      <w:r>
-        <w:rPr>
-          <w:rFonts w:hint="cs"/>
-          <w:rtl/>
-        </w:rPr>
-        <w:t xml:space="preserve">סטטוס </w:t>
-      </w:r>
-      <w:r>
-        <w:rPr>
-          <w:rtl/>
-        </w:rPr>
-        <w:t>–</w:t>
-      </w:r>
-      <w:r>
-        <w:rPr>
-          <w:rFonts w:hint="cs"/>
-          <w:rtl/>
-        </w:rPr>
-        <w:t xml:space="preserve"> </w:t>
-      </w:r>
-      <w:r>
-        <w:t>toggle</w:t>
-      </w:r>
-    </w:p>
-    <w:p>
-      <w:pPr>
-        <w:rPr>
-          <w:rtl/>
-        </w:rPr>
-      </w:pPr>
-      <w:proofErr w:type="spellStart"/>
-      <w:r>
-        <w:rPr>
-          <w:rFonts w:hint="cs"/>
-          <w:rtl/>
-        </w:rPr>
-        <w:t>פופאפ</w:t>
-      </w:r>
-      <w:proofErr w:type="spellEnd"/>
-      <w:r>
-        <w:rPr>
-          <w:rFonts w:hint="cs"/>
-          <w:rtl/>
-        </w:rPr>
-        <w:t>:</w:t>
-      </w:r>
-    </w:p>
-    <w:p>
-      <w:pPr>
-        <w:rPr>
-          <w:rtl/>
-        </w:rPr>
-      </w:pPr>
-      <w:r>
-        <w:rPr>
-          <w:rFonts w:hint="cs"/>
-          <w:rtl/>
-        </w:rPr>
-        <w:t>סטטוס</w:t>
-      </w:r>
-    </w:p>
-    <w:p>
-      <w:pPr>
-        <w:rPr>
-          <w:rtl/>
-        </w:rPr>
-      </w:pPr>
-    </w:p>
-    <w:p>
-      <w:pPr>
-        <w:rPr>
-          <w:rtl/>
-        </w:rPr>
-      </w:pPr>
-      <w:r>
-        <w:rPr>
-          <w:rFonts w:hint="cs"/>
-          <w:rtl/>
-        </w:rPr>
-        <w:t xml:space="preserve">מוצרים </w:t>
-      </w:r>
-      <w:r>
-        <w:rPr>
-          <w:rtl/>
-        </w:rPr>
-        <w:t>–</w:t>
-      </w:r>
-      <w:r>
-        <w:rPr>
-          <w:rFonts w:hint="cs"/>
-          <w:rtl/>
-        </w:rPr>
-        <w:t xml:space="preserve"> בניית טבלה חדשה</w:t>
-      </w:r>
-    </w:p>
-    <w:p>
-      <w:pPr>
-        <w:rPr>
-          <w:rtl/>
-        </w:rPr>
-      </w:pPr>
-      <w:r>
-        <w:rPr>
-          <w:rFonts w:hint="cs"/>
-          <w:rtl/>
-        </w:rPr>
-        <w:t>שדות: קטגוריה, חברה, דגם, הערות</w:t>
-      </w:r>
-    </w:p>
-    <w:p>
-      <w:pPr>
-        <w:rPr>
-          <w:rtl/>
-        </w:rPr>
-      </w:pPr>
-    </w:p>
-    <w:p>
-      <w:pPr>
-        <w:rPr>
-          <w:rtl/>
-        </w:rPr>
-      </w:pPr>
-      <w:r>
-        <w:rPr>
-          <w:rFonts w:hint="cs"/>
-          <w:rtl/>
-        </w:rPr>
-        <w:lastRenderedPageBreak/>
-        <w:t xml:space="preserve">רכישות: </w:t>
-      </w:r>
-    </w:p>
-    <w:p>
-      <w:pPr>
-        <w:rPr>
-          <w:rtl/>
-        </w:rPr>
-      </w:pPr>
-      <w:r>
-        <w:rPr>
-          <w:rFonts w:hint="cs"/>
-          <w:rtl/>
-        </w:rPr>
-        <w:t xml:space="preserve">מוצר </w:t>
-      </w:r>
-      <w:r>
-        <w:rPr>
-          <w:rtl/>
-        </w:rPr>
-        <w:t>–</w:t>
-      </w:r>
-      <w:r>
-        <w:rPr>
-          <w:rFonts w:hint="cs"/>
-          <w:rtl/>
-        </w:rPr>
         <w:t xml:space="preserve"> שרשור של קטגוריה + דגם</w:t>
       </w:r>
     </w:p>
-    <w:p/>
-    <w:p/>
     <w:sectPr>
       <w:pgSz w:w="11906" w:h="16838"/>
       <w:pgMar w:top="1440" w:right="1800" w:bottom="1440" w:left="1800" w:header="708" w:footer="708" w:gutter="0"/>

</xml_diff>